<commit_message>
Week 1: swap to finished new-model build (paper-only Tue; PE#1)
Production was serving the stale pre-model draft: Tuesday carried app
links (violates Low-Tech Tuesday) and the old two-artifact + QFT scheme
was still live. Replace with the finished build/: paper-only Tuesday,
three-games -> Pedagogical Excursion #1 Thursday, reading homework +
journal. Retire solution-report, thinking-analysis-report, qft docx.

Co-Authored-By: Claude Opus 4.8 (1M context) <noreply@anthropic.com>
</commit_message>
<xml_diff>
--- a/week-1-reasoning-puzzles/week-1-t1-handout.docx
+++ b/week-1-reasoning-puzzles/week-1-t1-handout.docx
@@ -121,7 +121,7 @@
           <w:rFonts w:ascii="Inter" w:hAnsi="Inter"/>
           <w:i/>
         </w:rPr>
-        <w:t>What is the goal? What are the rules? Write down what you notice from the solved example before you go on.</w:t>
+        <w:t>(1) What is the goal? What are the rules? Write down what you notice from the solved example before you go on.</w:t>
       </w:r>
     </w:p>
     <w:p>
@@ -178,15 +178,14 @@
     </w:p>
     <w:p>
       <w:pPr>
-        <w:jc w:val="center"/>
+        <w:spacing w:after="120"/>
       </w:pPr>
       <w:r>
         <w:rPr>
           <w:rFonts w:ascii="Inter" w:hAnsi="Inter"/>
-          <w:b/>
-          <w:color w:val="1F4E96"/>
+          <w:i/>
         </w:rPr>
-        <w:t>When you finish: how do you know this is the only solution it could be?</w:t>
+        <w:t>(2) When you finish: how confident are you that this is the only solution? How do you know?</w:t>
       </w:r>
     </w:p>
     <w:p>
@@ -264,7 +263,7 @@
           <w:rFonts w:ascii="Inter" w:hAnsi="Inter"/>
           <w:i/>
         </w:rPr>
-        <w:t>What is the goal? What are the rules? Write down what you notice from the solved example before you go on.</w:t>
+        <w:t>(1) What is the goal? What are the rules? Write down what you notice from the solved example before you go on.</w:t>
       </w:r>
     </w:p>
     <w:p>
@@ -321,15 +320,14 @@
     </w:p>
     <w:p>
       <w:pPr>
-        <w:jc w:val="center"/>
+        <w:spacing w:after="120"/>
       </w:pPr>
       <w:r>
         <w:rPr>
           <w:rFonts w:ascii="Inter" w:hAnsi="Inter"/>
-          <w:b/>
-          <w:color w:val="1F4E96"/>
+          <w:i/>
         </w:rPr>
-        <w:t>When you finish: how do you know this is the only solution it could be?</w:t>
+        <w:t>(2) When you finish: how confident are you that this is the only solution? How do you know?</w:t>
       </w:r>
     </w:p>
     <w:p>
@@ -407,7 +405,7 @@
           <w:rFonts w:ascii="Inter" w:hAnsi="Inter"/>
           <w:i/>
         </w:rPr>
-        <w:t>What is the goal? What are the rules? Write down what you notice from the solved example before you go on.</w:t>
+        <w:t>(1) What is the goal? What are the rules? Write down what you notice from the solved example before you go on.</w:t>
       </w:r>
     </w:p>
     <w:p>
@@ -464,15 +462,19 @@
     </w:p>
     <w:p>
       <w:pPr>
-        <w:jc w:val="center"/>
+        <w:spacing w:after="120"/>
       </w:pPr>
       <w:r>
         <w:rPr>
           <w:rFonts w:ascii="Inter" w:hAnsi="Inter"/>
-          <w:b/>
-          <w:color w:val="1F4E96"/>
+          <w:i/>
         </w:rPr>
-        <w:t>When you finish: how do you know this is the only solution it could be?</w:t>
+        <w:t>(2) When you finish: how confident are you that this is the only solution? How do you know?</w:t>
+      </w:r>
+    </w:p>
+    <w:p>
+      <w:r>
+        <w:br w:type="page"/>
       </w:r>
     </w:p>
     <w:p>
@@ -485,7 +487,7 @@
           <w:b/>
           <w:color w:val="1F4E96"/>
         </w:rPr>
-        <w:t>Before You Leave — Paper vs. Screen</w:t>
+        <w:t>Thoughts for Thursday</w:t>
       </w:r>
     </w:p>
     <w:p>
@@ -494,7 +496,7 @@
           <w:rFonts w:ascii="Inter" w:hAnsi="Inter"/>
           <w:i w:val="0"/>
         </w:rPr>
-        <w:t>You solved on screen this morning and on paper just now. What did the app do for you that you had to do for yourself on paper? When you are the teacher, when would you want a child working with the app — and when with the paper?</w:t>
+        <w:t>Today you worked entirely on paper — no app doing any of the thinking for you, and no “Check” button to tell you when you were right. What did that force you to do for yourself? Thursday you'll solve these same puzzles on the screen, and we'll ask what the paper made you notice.</w:t>
       </w:r>
     </w:p>
     <w:sectPr>

</xml_diff>